<commit_message>
fix: add working default styling for docx.
</commit_message>
<xml_diff>
--- a/scripts/starlight/.fcc/docx/reference.docx
+++ b/scripts/starlight/.fcc/docx/reference.docx
@@ -1016,26 +1016,41 @@
   <w:style w:type="table" w:default="1" w:styleId="Table">
     <w:name w:val="Table"/>
     <w:basedOn w:val="TableNormal"/>
-    <w:semiHidden/>
-    <w:unhideWhenUsed/>
-    <w:qFormat/>
+    <w:uiPriority w:val="59"/>
     <w:tblPr>
       <w:tblInd w:w="0" w:type="dxa"/>
+      <w:tblBorders>
+        <w:top w:val="single" w:sz="4" w:space="0" w:color="808080"/>
+        <w:left w:val="single" w:sz="4" w:space="0" w:color="808080"/>
+        <w:bottom w:val="single" w:sz="4" w:space="0" w:color="808080"/>
+        <w:right w:val="single" w:sz="4" w:space="0" w:color="808080"/>
+        <w:insideH w:val="single" w:sz="4" w:space="0" w:color="808080"/>
+        <w:insideV w:val="single" w:sz="4" w:space="0" w:color="808080"/>
+      </w:tblBorders>
       <w:tblCellMar>
-        <w:top w:w="0" w:type="dxa"/>
+        <w:top w:w="20" w:type="dxa"/>
         <w:left w:w="108" w:type="dxa"/>
-        <w:bottom w:w="0" w:type="dxa"/>
+        <w:bottom w:w="20" w:type="dxa"/>
         <w:right w:w="108" w:type="dxa"/>
       </w:tblCellMar>
     </w:tblPr>
     <w:tblStylePr w:type="firstRow">
+      <w:rPr>
+        <w:b/>
+      </w:rPr>
       <w:tcPr>
+        <w:shd w:val="clear" w:color="auto" w:fill="CCCCCC"/>
         <w:tcBorders>
-          <w:bottom w:val="single"/>
+          <w:bottom w:val="single" w:sz="4" w:space="0" w:color="808080"/>
         </w:tcBorders>
         <w:vAlign w:val="bottom"/>
       </w:tcPr>
     </w:tblStylePr>
+    <w:tblStylePr w:type="band1Horz">
+      <w:tcPr>
+        <w:shd w:val="clear" w:color="auto" w:fill="F5F5F5"/>
+      </w:tcPr>
+    </w:tblStylePr>
   </w:style>
   <w:style w:type="paragraph" w:customStyle="1" w:styleId="DefinitionTerm">
     <w:name w:val="Definition Term"/>
@@ -1097,6 +1112,8 @@
     <w:basedOn w:val="BodyTextChar"/>
     <w:rPr>
       <w:rFonts w:ascii="Consolas" w:hAnsi="Consolas"/>
+      <w:b/>
+      <w:color w:val="0087AF"/>
       <w:sz w:val="22"/>
     </w:rPr>
   </w:style>
@@ -1185,13 +1202,13 @@
     <w:unhideWhenUsed/>
     <w:pPr>
       <w:pBdr>
-        <w:top w:val="single" w:sz="4" w:space="4" w:color="D0D0D0"/>
-        <w:left w:val="single" w:sz="4" w:space="4" w:color="D0D0D0"/>
-        <w:bottom w:val="single" w:sz="4" w:space="4" w:color="D0D0D0"/>
-        <w:right w:val="single" w:sz="4" w:space="4" w:color="D0D0D0"/>
+        <w:top w:val="single" w:sz="4" w:space="4" w:color="3A3A3A"/>
+        <w:left w:val="single" w:sz="4" w:space="4" w:color="3A3A3A"/>
+        <w:bottom w:val="single" w:sz="4" w:space="4" w:color="3A3A3A"/>
+        <w:right w:val="single" w:sz="4" w:space="4" w:color="3A3A3A"/>
       </w:pBdr>
-      <w:shd w:val="clear" w:color="auto" w:fill="F5F5F5"/>
-      <w:spacing w:before="60" w:after="60" w:line="240" w:lineRule="auto"/>
+      <w:shd w:val="clear" w:color="auto" w:fill="262626"/>
+      <w:spacing w:before="0" w:after="0" w:line="240" w:lineRule="auto"/>
     </w:pPr>
     <w:rPr>
       <w:rFonts w:ascii="DejaVu Sans Mono" w:hAnsi="DejaVu Sans Mono" w:cs="DejaVu Sans Mono"/>

</xml_diff>

<commit_message>
feat: add DOCX reference-doc generator (build-reference.py)
Replace the hand-patched reference.docx with a reproducible, spec-driven
build. build-reference.py starts from Pandoc's default reference and
overlays, from declarative specs:
  - scomp-link's existing look, preserved 1:1 (dark #262626 code blocks,
    teal #0087AF inline code, grid+banded tables, TOC dot-leaders,
    updateFields)
  - a running header (optional logo + {{TITLE}}{{VERSION_SUFFIX}} +
    Created By: {{AUTHOR}} ({{DATE}})) and footer ({{DATE}} .
    {{CLASSIFICATION}} . Page X / Y)
  - A4 page size + margins

Ships two variants: reference.docx (letterhead) and reference-plain.docx
(--no-letterhead, no running header/footer). build-reference.py is a
build-time tool (needs pandoc + lxml); runtime conversion stays stdlib.
</commit_message>
<xml_diff>
--- a/scripts/starlight/.fcc/docx/reference.docx
+++ b/scripts/starlight/.fcc/docx/reference.docx
@@ -314,9 +314,11 @@
       </w:r>
     </w:p>
     <w:sectPr>
-      <w:footnotePr>
-        <w:numRestart w:val="eachSect"/>
-      </w:footnotePr>
+      <w:headerReference w:type="default" r:id="rIdHdr"/>
+      <w:footerReference w:type="default" r:id="rIdFtr"/>
+      <w:pgSz w:w="11906" w:h="16838"/>
+      <w:pgMar w:top="1440" w:right="1080" w:bottom="1440" w:left="1080" w:header="720" w:footer="600" w:gutter="0"/>
+      <w:cols w:space="720"/>
     </w:sectPr>
   </w:body>
 </w:document>
@@ -326,6 +328,73 @@
 <w:comments xmlns:w="http://schemas.openxmlformats.org/wordprocessingml/2006/main" xmlns:m="http://schemas.openxmlformats.org/officeDocument/2006/math" xmlns:r="http://schemas.openxmlformats.org/officeDocument/2006/relationships" xmlns:o="urn:schemas-microsoft-com:office:office" xmlns:v="urn:schemas-microsoft-com:vml" xmlns:w10="urn:schemas-microsoft-com:office:word" xmlns:a="http://schemas.openxmlformats.org/drawingml/2006/main" xmlns:pic="http://schemas.openxmlformats.org/drawingml/2006/picture" xmlns:wp="http://schemas.openxmlformats.org/drawingml/2006/wordprocessingDrawing"/>
 </file>
 
+<file path=word/footer2.xml><?xml version="1.0" encoding="utf-8"?>
+<w:ftr xmlns:w="http://schemas.openxmlformats.org/wordprocessingml/2006/main" xmlns:r="http://schemas.openxmlformats.org/officeDocument/2006/relationships" xmlns:wp="http://schemas.openxmlformats.org/drawingml/2006/wordprocessingDrawing" xmlns:a="http://schemas.openxmlformats.org/drawingml/2006/main" xmlns:pic="http://schemas.openxmlformats.org/drawingml/2006/picture">
+  <w:p>
+    <w:pPr>
+      <w:tabs>
+        <w:tab w:val="center" w:pos="4680"/>
+        <w:tab w:val="right" w:pos="9350"/>
+      </w:tabs>
+      <w:spacing w:after="0"/>
+      <w:rPr>
+        <w:color w:val="6B7280"/>
+        <w:sz w:val="16"/>
+      </w:rPr>
+    </w:pPr>
+    <w:r>
+      <w:rPr>
+        <w:color w:val="6B7280"/>
+        <w:sz w:val="16"/>
+      </w:rPr>
+      <w:t xml:space="preserve">{{DATE}}</w:t>
+    </w:r>
+    <w:r>
+      <w:rPr>
+        <w:b/>
+        <w:color w:val="6B7280"/>
+        <w:sz w:val="16"/>
+      </w:rPr>
+      <w:tab/>
+      <w:t xml:space="preserve">{{CLASSIFICATION}}</w:t>
+    </w:r>
+    <w:r>
+      <w:rPr>
+        <w:color w:val="6B7280"/>
+        <w:sz w:val="16"/>
+      </w:rPr>
+      <w:tab/>
+      <w:t xml:space="preserve">Page </w:t>
+    </w:r>
+    <w:fldSimple w:instr=" PAGE ">
+      <w:r>
+        <w:rPr>
+          <w:color w:val="6B7280"/>
+          <w:sz w:val="16"/>
+        </w:rPr>
+        <w:t>1</w:t>
+      </w:r>
+    </w:fldSimple>
+    <w:r>
+      <w:rPr>
+        <w:color w:val="6B7280"/>
+        <w:sz w:val="16"/>
+      </w:rPr>
+      <w:t xml:space="preserve"> / </w:t>
+    </w:r>
+    <w:fldSimple w:instr=" NUMPAGES ">
+      <w:r>
+        <w:rPr>
+          <w:color w:val="6B7280"/>
+          <w:sz w:val="16"/>
+        </w:rPr>
+        <w:t>1</w:t>
+      </w:r>
+    </w:fldSimple>
+  </w:p>
+</w:ftr>
+</file>
+
 <file path=word/footnotes.xml><?xml version="1.0" encoding="utf-8"?>
 <w:footnotes xmlns:w="http://schemas.openxmlformats.org/wordprocessingml/2006/main" xmlns:m="http://schemas.openxmlformats.org/officeDocument/2006/math" xmlns:r="http://schemas.openxmlformats.org/officeDocument/2006/relationships" xmlns:o="urn:schemas-microsoft-com:office:office" xmlns:v="urn:schemas-microsoft-com:vml" xmlns:w10="urn:schemas-microsoft-com:office:word" xmlns:a="http://schemas.openxmlformats.org/drawingml/2006/main" xmlns:pic="http://schemas.openxmlformats.org/drawingml/2006/picture" xmlns:wp="http://schemas.openxmlformats.org/drawingml/2006/wordprocessingDrawing">
   <w:footnote w:type="continuationSeparator" w:id="0">
@@ -367,6 +436,38 @@
     </w:p>
   </w:footnote>
 </w:footnotes>
+</file>
+
+<file path=word/header2.xml><?xml version="1.0" encoding="utf-8"?>
+<w:hdr xmlns:w="http://schemas.openxmlformats.org/wordprocessingml/2006/main" xmlns:r="http://schemas.openxmlformats.org/officeDocument/2006/relationships" xmlns:wp="http://schemas.openxmlformats.org/drawingml/2006/wordprocessingDrawing" xmlns:a="http://schemas.openxmlformats.org/drawingml/2006/main" xmlns:pic="http://schemas.openxmlformats.org/drawingml/2006/picture">
+  <w:p>
+    <w:pPr>
+      <w:jc w:val="right"/>
+      <w:spacing w:before="0" w:after="60" w:line="240" w:lineRule="auto"/>
+    </w:pPr>
+    <w:r>
+      <w:rPr>
+        <w:b/>
+        <w:color w:val="111827"/>
+        <w:sz w:val="20"/>
+      </w:rPr>
+      <w:t xml:space="preserve">{{TITLE}}{{VERSION_SUFFIX}}</w:t>
+    </w:r>
+  </w:p>
+  <w:p>
+    <w:pPr>
+      <w:jc w:val="right"/>
+      <w:spacing w:before="0" w:after="60" w:line="240" w:lineRule="auto"/>
+    </w:pPr>
+    <w:r>
+      <w:rPr>
+        <w:color w:val="6B7280"/>
+        <w:sz w:val="16"/>
+      </w:rPr>
+      <w:t xml:space="preserve">Created By: {{AUTHOR}} ({{DATE}})</w:t>
+    </w:r>
+  </w:p>
+</w:hdr>
 </file>
 
 <file path=word/numbering.xml><?xml version="1.0" encoding="utf-8"?>
@@ -1015,10 +1116,7 @@
   </w:style>
   <w:style w:type="table" w:default="1" w:styleId="Table">
     <w:name w:val="Table"/>
-    <w:basedOn w:val="TableNormal"/>
-    <w:uiPriority w:val="59"/>
     <w:tblPr>
-      <w:tblInd w:w="0" w:type="dxa"/>
       <w:tblBorders>
         <w:top w:val="single" w:sz="4" w:space="0" w:color="808080"/>
         <w:left w:val="single" w:sz="4" w:space="0" w:color="808080"/>
@@ -1034,16 +1132,16 @@
         <w:right w:w="108" w:type="dxa"/>
       </w:tblCellMar>
     </w:tblPr>
+    <w:basedOn w:val="TableNormal"/>
+    <w:semiHidden/>
+    <w:unhideWhenUsed/>
+    <w:qFormat/>
     <w:tblStylePr w:type="firstRow">
       <w:rPr>
         <w:b/>
       </w:rPr>
       <w:tcPr>
         <w:shd w:val="clear" w:color="auto" w:fill="CCCCCC"/>
-        <w:tcBorders>
-          <w:bottom w:val="single" w:sz="4" w:space="0" w:color="808080"/>
-        </w:tcBorders>
-        <w:vAlign w:val="bottom"/>
       </w:tcPr>
     </w:tblStylePr>
     <w:tblStylePr w:type="band1Horz">
@@ -1112,9 +1210,8 @@
     <w:basedOn w:val="BodyTextChar"/>
     <w:rPr>
       <w:rFonts w:ascii="Consolas" w:hAnsi="Consolas"/>
-      <w:b/>
+      <w:sz w:val="22"/>
       <w:color w:val="0087AF"/>
-      <w:sz w:val="22"/>
     </w:rPr>
   </w:style>
   <w:style w:type="character" w:customStyle="1" w:styleId="SectionNumber">
@@ -1154,66 +1251,36 @@
     </w:rPr>
   </w:style>
   <w:style w:type="paragraph" w:styleId="TOC1">
+    <w:pPr>
+      <w:tabs>
+        <w:tab w:val="right" w:leader="dot" w:pos="9350"/>
+      </w:tabs>
+    </w:pPr>
     <w:name w:val="toc 1"/>
     <w:basedOn w:val="Normal"/>
-    <w:next w:val="Normal"/>
     <w:uiPriority w:val="39"/>
-    <w:unhideWhenUsed/>
-    <w:pPr>
-      <w:tabs>
-        <w:tab w:val="right" w:leader="dot" w:pos="9360"/>
-      </w:tabs>
-      <w:spacing w:after="0"/>
-    </w:pPr>
   </w:style>
   <w:style w:type="paragraph" w:styleId="TOC2">
-    <w:name w:val="toc 2"/>
-    <w:basedOn w:val="Normal"/>
-    <w:next w:val="Normal"/>
-    <w:uiPriority w:val="39"/>
-    <w:unhideWhenUsed/>
     <w:pPr>
       <w:ind w:left="220"/>
       <w:tabs>
-        <w:tab w:val="right" w:leader="dot" w:pos="9360"/>
+        <w:tab w:val="right" w:leader="dot" w:pos="9350"/>
       </w:tabs>
-      <w:spacing w:after="0"/>
-    </w:pPr>
+    </w:pPr>
+    <w:name w:val="toc 2"/>
+    <w:basedOn w:val="Normal"/>
+    <w:uiPriority w:val="39"/>
   </w:style>
   <w:style w:type="paragraph" w:styleId="TOC3">
-    <w:name w:val="toc 3"/>
-    <w:basedOn w:val="Normal"/>
-    <w:next w:val="Normal"/>
-    <w:uiPriority w:val="39"/>
-    <w:unhideWhenUsed/>
     <w:pPr>
       <w:ind w:left="440"/>
       <w:tabs>
-        <w:tab w:val="right" w:leader="dot" w:pos="9360"/>
+        <w:tab w:val="right" w:leader="dot" w:pos="9350"/>
       </w:tabs>
-      <w:spacing w:after="0"/>
-    </w:pPr>
-  </w:style>
-  <w:style w:type="paragraph" w:customStyle="1" w:styleId="SourceCode">
-    <w:name w:val="Source Code"/>
-    <w:basedOn w:val="Normal"/>
-    <w:link w:val="VerbatimChar"/>
-    <w:uiPriority w:val="29"/>
-    <w:unhideWhenUsed/>
-    <w:pPr>
-      <w:pBdr>
-        <w:top w:val="single" w:sz="4" w:space="4" w:color="3A3A3A"/>
-        <w:left w:val="single" w:sz="4" w:space="4" w:color="3A3A3A"/>
-        <w:bottom w:val="single" w:sz="4" w:space="4" w:color="3A3A3A"/>
-        <w:right w:val="single" w:sz="4" w:space="4" w:color="3A3A3A"/>
-      </w:pBdr>
-      <w:shd w:val="clear" w:color="auto" w:fill="262626"/>
-      <w:spacing w:before="0" w:after="0" w:line="240" w:lineRule="auto"/>
-    </w:pPr>
-    <w:rPr>
-      <w:rFonts w:ascii="DejaVu Sans Mono" w:hAnsi="DejaVu Sans Mono" w:cs="DejaVu Sans Mono"/>
-      <w:sz w:val="18"/>
-    </w:rPr>
+    </w:pPr>
+    <w:name w:val="toc 3"/>
+    <w:basedOn w:val="Normal"/>
+    <w:uiPriority w:val="39"/>
   </w:style>
 </w:styles>
 </file>

</xml_diff>